<commit_message>
docs(astra): remove blank pages from final W11-06 DOCX
</commit_message>
<xml_diff>
--- a/docs/source-of-truth/planning/current/15_STEP_11_W11_06_PLAYBACK_SPECTRUM_CHARTER_LAGU_FULL_ALBUM_v1_0.docx
+++ b/docs/source-of-truth/planning/current/15_STEP_11_W11_06_PLAYBACK_SPECTRUM_CHARTER_LAGU_FULL_ALBUM_v1_0.docx
@@ -75,13 +75,9 @@
       </w:r>
     </w:p>
     <w:p>
-      <w:r>
-        <w:br w:type="page"/>
-      </w:r>
-    </w:p>
-    <w:p>
       <w:pPr>
         <w:pStyle w:val="Heading1"/>
+        <w:pageBreakBefore/>
       </w:pPr>
       <w:r>
         <w:t xml:space="preserve">BAB I — Charter dan Batasan Teknis</w:t>
@@ -95,7 +91,6 @@
         <w:t xml:space="preserve">ASTRA W11-06 — Playback Audio Asli dan Spectrum Reaktif (Final Charter v1.0)</w:t>
       </w:r>
     </w:p>
-    <w:p/>
     <w:p>
       <w:pPr>
         <w:pStyle w:val="Normal"/>
@@ -120,7 +115,6 @@
         <w:t xml:space="preserve">Source-of-truth: Product Definition + current UI references + STEP 06/07 + W11-05 closure. Full final companion DOCX at docs/source-of-truth/planning/current/15_STEP_11_W11_06_PLAYBACK_SPECTRUM_CHARTER_LAGU_FULL_ALBUM_v1_0.docx.</w:t>
       </w:r>
     </w:p>
-    <w:p/>
     <w:p>
       <w:pPr>
         <w:pStyle w:val="Heading2"/>
@@ -137,7 +131,6 @@
         <w:t xml:space="preserve">An imported/validated local album can audibly Play, Pause and continue through enabled ordered tracks; previous/next and seeking follow one deterministic album clock. Real FFT uses decoded playing audio, not random/demo bars. Progress and active metadata/artwork derive from that same clock. Playback controls and analyzer are UI-session only and never mark the project dirty. Source files stay read-only. The portable Windows 11 x64 Electron test build must prove this on real MP3 and WAV sound files and recover gracefully from missing/unsupported media. Completion of this wave is NOT MP4 output.</w:t>
       </w:r>
     </w:p>
-    <w:p/>
     <w:p>
       <w:pPr>
         <w:pStyle w:val="Heading2"/>
@@ -170,7 +163,6 @@
         <w:t xml:space="preserve">Error and loading copy must reuse approved existing shared status/warning patterns. Do not claim static visual samples are actual FFT until audio is running. Artwork and time labels must be honest.</w:t>
       </w:r>
     </w:p>
-    <w:p/>
     <w:p>
       <w:pPr>
         <w:pStyle w:val="Heading2"/>
@@ -195,7 +187,6 @@
         <w:t xml:space="preserve">Player state values: idle / ready / loading / playing / paused / seeking / finished / blocked / error, with generation ID and project ID on every async operation. Only one current generation may publish state or resume audio. Media.currentTime is primary playback clock; RAF is visual sampling scheduling, not another time authority. Pause freezes progress; Stop releases media and resets spectrum; playback resumes at correct local time.</w:t>
       </w:r>
     </w:p>
-    <w:p/>
     <w:p>
       <w:pPr>
         <w:pStyle w:val="Heading2"/>
@@ -212,7 +203,6 @@
         <w:t xml:space="preserve">Electron main owns source media, path identity, file checks, asset grants and lifecycle. Proposed design: private scoped app-owned media protocol or equivalently audited main-owned bounded byte stream with required Range handling; finalized under T11-W06-02 safety acceptance. Renderer requests a typed asset ID or opaque short-lived grant, never arbitrary paths. Disallow traversal, symlink escape, cross-project IDs, expired tokens, invalid byte ranges and unbounded whole-file IPC buffers. No source edits, disk writes, ffmpeg shelling, network/cloud, safeStorage/keys in renderer. Failed/unreadable/corrupt codec must show blocked error, not play a fake sample. Probe metadata ≠ decoder support; actual packaged Windows MP3/WAV decoding is required and other formats remain unverified until proven.</w:t>
       </w:r>
     </w:p>
-    <w:p/>
     <w:p>
       <w:pPr>
         <w:pStyle w:val="Heading2"/>
@@ -229,7 +219,6 @@
         <w:t xml:space="preserve">Use one playing HTMLMediaElement with a WebAudio MediaElementAudioSourceNode→AnalyserNode graph, or an equivalent measured verified adapter, without decoding hours of audio into RAM. FFT bars reflect only actual decoded audio energy and respond to test 440Hz tone/silence. No random bars, hardcoded heights, demo waveform or silent fake success in active playback. Render within existing spectrum/progress layer transform/visibility/z-order. Throttle sample publishing for Windows resources. Define pause/silence/stop behavior explicitly; avoid stale analyzer frames. Live FFT cannot automatically stand in for future deterministic offline MP4 spectrum: that belongs to STEP12 render design.</w:t>
       </w:r>
     </w:p>
-    <w:p/>
     <w:p>
       <w:pPr>
         <w:pStyle w:val="Heading2"/>
@@ -246,7 +235,6 @@
         <w:t xml:space="preserve">01: pure typed playback contract + pure album time map tests. 02: main-owned secure media gateway + real codec smoke. 03: single playback state machine with generation guards, Play/Pause/Stop/Seek/Next/Prev. 04: real WebAudio FFT and progress runtime, sine/silence test. 05: frozen transport/timecode/timeline/visual wiring. 06: 128-track load, race and resource hardening. 07: genuine Windows listening/E2E, fingerprints, no-dirty, portable ZIP, drift/DoD and closure. Every task is individually verified; only one task proceeds at a time.</w:t>
       </w:r>
     </w:p>
-    <w:p/>
     <w:p>
       <w:pPr>
         <w:pStyle w:val="Heading2"/>
@@ -287,15 +275,10 @@
         <w:t xml:space="preserve">• Never mark W11-06 COMPLETE without real MP3/WAV playback and real FFT on packaged Windows. Provider/MP4/motion remain future gates.</w:t>
       </w:r>
     </w:p>
-    <w:p/>
-    <w:p>
-      <w:r>
-        <w:br w:type="page"/>
-      </w:r>
-    </w:p>
     <w:p>
       <w:pPr>
         <w:pStyle w:val="Heading1"/>
+        <w:pageBreakBefore/>
       </w:pPr>
       <w:r>
         <w:t xml:space="preserve">BAB II — Kartu Tugas Implementasi</w:t>
@@ -309,7 +292,6 @@
         <w:t xml:space="preserve">W11-06 — Final Serial Task Cards (ASTRA v1.0)</w:t>
       </w:r>
     </w:p>
-    <w:p/>
     <w:p>
       <w:pPr>
         <w:pStyle w:val="Normal"/>
@@ -318,7 +300,6 @@
         <w:t xml:space="preserve">Dependency: W11-05 merged. Execution: only one task after approved ASTRA charter+DOCX+DoR merge; T11-W06-01 then 02..07 strictly serial. Every later task remains BLOCKED until predecessor CI/evidence PASS.</w:t>
       </w:r>
     </w:p>
-    <w:p/>
     <w:tbl>
       <w:tblPr>
         <w:tblW w:w="0" w:type="auto"/>
@@ -784,7 +765,6 @@
         </w:tc>
       </w:tr>
     </w:tbl>
-    <w:p/>
     <w:p>
       <w:pPr>
         <w:pStyle w:val="Normal"/>
@@ -809,15 +789,10 @@
         <w:t xml:space="preserve">Task 05 freeze rule: existing Play/Pause, Previous/Next, timecode, volume, progress and timeline positions from approved UI-IMG-002B/002D; no visible Stop control. Missing new UI state =&gt; stop and return to ASTRA/user.</w:t>
       </w:r>
     </w:p>
-    <w:p/>
-    <w:p>
-      <w:r>
-        <w:br w:type="page"/>
-      </w:r>
-    </w:p>
     <w:p>
       <w:pPr>
         <w:pStyle w:val="Heading1"/>
+        <w:pageBreakBefore/>
       </w:pPr>
       <w:r>
         <w:t xml:space="preserve">BAB III — Matriks Penerimaan 20 AC</w:t>
@@ -831,7 +806,6 @@
         <w:t xml:space="preserve">W11-06 — Final 20-AC Acceptance Matrix (ASTRA v1.0)</w:t>
       </w:r>
     </w:p>
-    <w:p/>
     <w:p>
       <w:pPr>
         <w:pStyle w:val="Normal"/>
@@ -840,7 +814,6 @@
         <w:t xml:space="preserve">Planning gate: Approved charter/DOCX and merged main required before SOL Task01. Implementation: NOT STARTED; every row below is NOT TESTED, not PASS. Measurement tolerances for audio clock drift/seek convergence/performance must be recorded from Windows baseline during T02–T03, not invented now.</w:t>
       </w:r>
     </w:p>
-    <w:p/>
     <w:tbl>
       <w:tblPr>
         <w:tblW w:w="0" w:type="auto"/>
@@ -1730,7 +1703,6 @@
         </w:tc>
       </w:tr>
     </w:tbl>
-    <w:p/>
     <w:p>
       <w:pPr>
         <w:pStyle w:val="Normal"/>
@@ -1739,7 +1711,6 @@
         <w:t xml:space="preserve">Test matrix: deterministic unit pure-domain mapper, typed IPC/contract, Electron component, real-audio Windows Play/Pause/Seek/Ended/FFT sine vs silence, security revocation/range, 128-track/100-restart stress and source SHA-256/size/mtime. Final CI includes format, TS/lint, architecture/secrets/portable-path/29 UI states, STEP 10 + W11-01..05, app package and Windows portable smoke.</w:t>
       </w:r>
     </w:p>
-    <w:p/>
     <w:p>
       <w:pPr>
         <w:pStyle w:val="Normal"/>
@@ -1748,15 +1719,10 @@
         <w:t xml:space="preserve">Closure: only when AC01–20 PASS, full DoD and regression PASS on exact PR commit, no material UI/architecture/trust drift, and the user has real playable preview. W11-07 / W11-08 / STEP12 are separate.</w:t>
       </w:r>
     </w:p>
-    <w:p/>
-    <w:p>
-      <w:r>
-        <w:br w:type="page"/>
-      </w:r>
-    </w:p>
     <w:p>
       <w:pPr>
         <w:pStyle w:val="Heading1"/>
+        <w:pageBreakBefore/>
       </w:pPr>
       <w:r>
         <w:t xml:space="preserve">BAB IV — Definition of Ready dan Pengendalian Gate</w:t>
@@ -1770,7 +1736,6 @@
         <w:t xml:space="preserve">W11-06 — Formal Definition of Ready (ASTRA v1.0)</w:t>
       </w:r>
     </w:p>
-    <w:p/>
     <w:p>
       <w:pPr>
         <w:pStyle w:val="Normal"/>
@@ -1779,7 +1744,6 @@
         <w:t xml:space="preserve">Planning verdict: PASS for T11-W06-01 AFTER final planning merge to main. Current implementation verdict: NOT STARTED. No Task02..07 authorized until serial previous-task gate PASS.</w:t>
       </w:r>
     </w:p>
-    <w:p/>
     <w:tbl>
       <w:tblPr>
         <w:tblW w:w="0" w:type="auto"/>
@@ -2382,7 +2346,6 @@
         </w:tc>
       </w:tr>
     </w:tbl>
-    <w:p/>
     <w:p>
       <w:pPr>
         <w:pStyle w:val="Normal"/>
@@ -2391,7 +2354,6 @@
         <w:t xml:space="preserve">Open technical measurements do not invalidate planning readiness for pure Task01: Windows codec support, actual FFT frequency accuracy, streaming Range limits, latency/memory budgets are explicit task-owned tests and may not be marked verified before real Electron runs. New architecture or UI decisions require ASTRA review.</w:t>
       </w:r>
     </w:p>
-    <w:p/>
     <w:p>
       <w:pPr>
         <w:pStyle w:val="Normal"/>
@@ -2400,7 +2362,6 @@
         <w:t xml:space="preserve">NEXT: Merge planning-only PR when CI PASS and all docs validated, then create dedicated SOL T11-W06-01 feature branch; no coding before that.</w:t>
       </w:r>
     </w:p>
-    <w:p/>
     <w:sectPr>
       <w:pgSz w:w="11906" w:h="16838"/>
       <w:pgMar w:top="900" w:right="750" w:bottom="850" w:left="750" w:header="450" w:footer="450"/>

</xml_diff>